<commit_message>
Fiche dispositifs : corrections factuelles et adaptation au cabinet
Corrections : participation CPF de 150 € depuis le 2 avril 2026 (et non
« en 2026 ») ; « 0 € à payer » remplacé par « 150 € non dus » (un reste à
charge reste possible) ; « plus de 600 consultants » Apec.
Adaptation au cabinet d'avocats : vocabulaire « cabinet » au lieu
d'« entreprise » / « employeur », OPCO EP nommé, ENADEP (formations du
personnel des avocats), lieux Mon CEP de Grenoble et Annecy, carte Apec
ciblant les cadres et avocats salariés, dotation « du cabinet ».

Co-Authored-By: Claude Opus 5.5 <noreply@anthropic.com>
Claude-Session: https://claude.ai/code/session_017zLT3dFfTsN6o1Gwcudkmu
</commit_message>
<xml_diff>
--- a/outils/fiche-recap-entretien-parcours-professionnel/Fiche_dispositifs_evolution_professionnelle.docx
+++ b/outils/fiche-recap-entretien-parcours-professionnel/Fiche_dispositifs_evolution_professionnelle.docx
@@ -175,7 +175,7 @@
           <w:sz w:val="13"/>
           <w:szCs w:val="13"/>
         </w:rPr>
-        <w:t xml:space="preserve">DOTATION DE L’EMPLOYEUR</w:t>
+        <w:t xml:space="preserve">DOTATION DU CABINET</w:t>
       </w:r>
     </w:p>
     <w:p>
@@ -395,7 +395,7 @@
                 <w:sz w:val="19"/>
                 <w:szCs w:val="19"/>
               </w:rPr>
-              <w:t xml:space="preserve">sans l’accord de votre employeur</w:t>
+              <w:t xml:space="preserve">sans l’accord du cabinet</w:t>
             </w:r>
             <w:r>
               <w:rPr>
@@ -459,7 +459,7 @@
                       <w:sz w:val="12"/>
                       <w:szCs w:val="12"/>
                     </w:rPr>
-                    <w:t xml:space="preserve">CADRES ET JEUNES DIPLÔMÉ(E)S</w:t>
+                    <w:t xml:space="preserve">CADRES · AVOCAT(E)S SALARIÉ(E)S</w:t>
                   </w:r>
                 </w:p>
                 <w:p>
@@ -725,7 +725,7 @@
                       <w:sz w:val="15"/>
                       <w:szCs w:val="15"/>
                     </w:rPr>
-                    <w:t xml:space="preserve">600 consultants en France</w:t>
+                    <w:t xml:space="preserve">Plus de 600 consultants en France</w:t>
                   </w:r>
                 </w:p>
               </w:tc>
@@ -782,7 +782,7 @@
                       <w:sz w:val="12"/>
                       <w:szCs w:val="12"/>
                     </w:rPr>
-                    <w:t xml:space="preserve">SALARIÉ(E)S DU PRIVÉ · AURA</w:t>
+                    <w:t xml:space="preserve">TOUS LES SALARIÉ(E)S · AURA</w:t>
                   </w:r>
                 </w:p>
                 <w:p>
@@ -1048,7 +1048,7 @@
                       <w:sz w:val="15"/>
                       <w:szCs w:val="15"/>
                     </w:rPr>
-                    <w:t xml:space="preserve">130 lieux d’accueil ou à distance</w:t>
+                    <w:t xml:space="preserve">130 lieux, dont Grenoble et Annecy</w:t>
                   </w:r>
                 </w:p>
               </w:tc>
@@ -1625,7 +1625,7 @@
                       <w:sz w:val="15"/>
                       <w:szCs w:val="15"/>
                     </w:rPr>
-                    <w:t xml:space="preserve">pour financer, avec l’appui possible de l’employeur, de l’OPCO ou de la Région</w:t>
+                    <w:t xml:space="preserve">pour financer, avec l’appui possible du cabinet, de l’OPCO EP ou de la Région</w:t>
                   </w:r>
                 </w:p>
               </w:tc>
@@ -1669,7 +1669,7 @@
                 <w:sz w:val="16"/>
                 <w:szCs w:val="16"/>
               </w:rPr>
-              <w:t xml:space="preserve"> ; congé VAE à demander par écrit à votre employeur.</w:t>
+              <w:t xml:space="preserve"> ; congé VAE à demander par écrit au cabinet.</w:t>
             </w:r>
           </w:p>
         </w:tc>
@@ -2107,7 +2107,7 @@
                       <w:sz w:val="15"/>
                       <w:szCs w:val="15"/>
                     </w:rPr>
-                    <w:t xml:space="preserve">de participation par formation en 2026, non due si l’employeur cofinance</w:t>
+                    <w:t xml:space="preserve">de participation par formation depuis le 2 avril 2026, non due si le cabinet cofinance</w:t>
                   </w:r>
                 </w:p>
               </w:tc>
@@ -2189,7 +2189,7 @@
                 <w:sz w:val="16"/>
                 <w:szCs w:val="16"/>
               </w:rPr>
-              <w:t xml:space="preserve">accord de l’employeur à demander 60 jours avant (120 jours si la formation dure 6 mois ou plus) ; sans réponse sous 30 jours, la demande est acceptée.</w:t>
+              <w:t xml:space="preserve">accord du cabinet à demander 60 jours avant (120 jours si la formation dure 6 mois ou plus) ; sans réponse sous 30 jours, la demande est acceptée.</w:t>
             </w:r>
           </w:p>
         </w:tc>
@@ -2304,7 +2304,7 @@
                 <w:sz w:val="18"/>
                 <w:szCs w:val="18"/>
               </w:rPr>
-              <w:t xml:space="preserve">Ce projet sert aussi l’entreprise ?</w:t>
+              <w:t xml:space="preserve">Ce projet sert aussi le cabinet ?</w:t>
             </w:r>
           </w:p>
         </w:tc>
@@ -2374,7 +2374,7 @@
                 <w:sz w:val="31"/>
                 <w:szCs w:val="31"/>
               </w:rPr>
-              <w:t xml:space="preserve">La dotation de l’employeur</w:t>
+              <w:t xml:space="preserve">La dotation du cabinet</w:t>
             </w:r>
           </w:p>
           <w:p>
@@ -2388,7 +2388,7 @@
                 <w:sz w:val="19"/>
                 <w:szCs w:val="19"/>
               </w:rPr>
-              <w:t xml:space="preserve">Votre employeur peut </w:t>
+              <w:t xml:space="preserve">Le cabinet peut </w:t>
             </w:r>
             <w:r>
               <w:rPr>
@@ -2424,7 +2424,7 @@
                 <w:sz w:val="19"/>
                 <w:szCs w:val="19"/>
               </w:rPr>
-              <w:t xml:space="preserve">, qui répond à vos souhaits et aux besoins de l’entreprise.</w:t>
+              <w:t xml:space="preserve">, qui répond à vos souhaits et à ses besoins.</w:t>
             </w:r>
           </w:p>
           <w:tbl>
@@ -2492,7 +2492,7 @@
                       <w:sz w:val="15"/>
                       <w:szCs w:val="15"/>
                     </w:rPr>
-                    <w:t xml:space="preserve">la dotation est utilisée avant vos droits CPF, qui complètent si nécessaire ; vous en êtes averti(e) sur votre compte</w:t>
+                    <w:t xml:space="preserve">la dotation du cabinet est utilisée avant vos droits CPF, qui complètent si nécessaire ; vous en êtes averti(e) sur votre compte</w:t>
                   </w:r>
                 </w:p>
               </w:tc>
@@ -2548,7 +2548,7 @@
                       <w:sz w:val="30"/>
                       <w:szCs w:val="30"/>
                     </w:rPr>
-                    <w:t xml:space="preserve">0 € à payer</w:t>
+                    <w:t xml:space="preserve">150 € non dus</w:t>
                   </w:r>
                 </w:p>
                 <w:p>
@@ -2562,12 +2562,53 @@
                       <w:sz w:val="15"/>
                       <w:szCs w:val="15"/>
                     </w:rPr>
-                    <w:t xml:space="preserve">la participation de 150 € n’est pas due en cas de cofinancement ; l’OPCO ou la Région peuvent aussi compléter</w:t>
+                    <w:t xml:space="preserve">la participation obligatoire n’est pas demandée en cas de cofinancement ; l’OPCO EP ou la Région peuvent aussi compléter</w:t>
                   </w:r>
                 </w:p>
               </w:tc>
             </w:tr>
           </w:tbl>
+          <w:p>
+            <w:pPr>
+              <w:spacing w:after="0" w:before="198" w:line="250" w:lineRule="auto"/>
+            </w:pPr>
+            <w:r>
+              <w:rPr>
+                <w:rFonts w:ascii="Open Sans SemiBold" w:cs="Open Sans SemiBold" w:eastAsia="Open Sans SemiBold" w:hAnsi="Open Sans SemiBold"/>
+                <w:color w:val="333333"/>
+                <w:sz w:val="16"/>
+                <w:szCs w:val="16"/>
+              </w:rPr>
+              <w:t xml:space="preserve">Formations métier : </w:t>
+            </w:r>
+            <w:r>
+              <w:rPr>
+                <w:rFonts w:ascii="Open Sans" w:cs="Open Sans" w:eastAsia="Open Sans" w:hAnsi="Open Sans"/>
+                <w:color w:val="333333"/>
+                <w:sz w:val="16"/>
+                <w:szCs w:val="16"/>
+              </w:rPr>
+              <w:t xml:space="preserve">l’ENADEP (</w:t>
+            </w:r>
+            <w:r>
+              <w:rPr>
+                <w:rFonts w:ascii="Open Sans SemiBold" w:cs="Open Sans SemiBold" w:eastAsia="Open Sans SemiBold" w:hAnsi="Open Sans SemiBold"/>
+                <w:color w:val="333333"/>
+                <w:sz w:val="16"/>
+                <w:szCs w:val="16"/>
+              </w:rPr>
+              <w:t xml:space="preserve">enadep.com</w:t>
+            </w:r>
+            <w:r>
+              <w:rPr>
+                <w:rFonts w:ascii="Open Sans" w:cs="Open Sans" w:eastAsia="Open Sans" w:hAnsi="Open Sans"/>
+                <w:color w:val="333333"/>
+                <w:sz w:val="16"/>
+                <w:szCs w:val="16"/>
+              </w:rPr>
+              <w:t xml:space="preserve">) forme le personnel des cabinets d’avocats ; ses formations peuvent être prises en charge par le cabinet ou l’OPCO EP, selon ses règles.</w:t>
+            </w:r>
+          </w:p>
           <w:p>
             <w:pPr>
               <w:spacing w:after="0" w:before="198" w:line="250" w:lineRule="auto"/>
@@ -2637,7 +2678,7 @@
                 <w:sz w:val="17"/>
                 <w:szCs w:val="17"/>
               </w:rPr>
-              <w:t xml:space="preserve">Parlez-en à votre responsable ou au service RH.</w:t>
+              <w:t xml:space="preserve">Parlez-en à votre responsable au cabinet.</w:t>
             </w:r>
           </w:p>
         </w:tc>
@@ -3203,7 +3244,7 @@
               <w:sz w:val="17"/>
               <w:szCs w:val="17"/>
             </w:rPr>
-            <w:t xml:space="preserve">Dotation de l’employeur</w:t>
+            <w:t xml:space="preserve">Dotation du cabinet</w:t>
           </w:r>
         </w:p>
         <w:p>
@@ -3217,7 +3258,7 @@
               <w:sz w:val="15"/>
               <w:szCs w:val="15"/>
             </w:rPr>
-            <w:t xml:space="preserve">Votre responsable ou le service RH</w:t>
+            <w:t xml:space="preserve">Votre responsable au cabinet</w:t>
           </w:r>
         </w:p>
         <w:p>
@@ -3231,7 +3272,21 @@
               <w:sz w:val="14"/>
               <w:szCs w:val="14"/>
             </w:rPr>
-            <w:t xml:space="preserve">Pour construire un projet de formation commun</w:t>
+            <w:t xml:space="preserve">Formations métier :</w:t>
+          </w:r>
+        </w:p>
+        <w:p>
+          <w:pPr>
+            <w:spacing w:after="0" w:line="235" w:lineRule="auto"/>
+          </w:pPr>
+          <w:r>
+            <w:rPr>
+              <w:rFonts w:ascii="Open Sans" w:cs="Open Sans" w:eastAsia="Open Sans" w:hAnsi="Open Sans"/>
+              <w:color w:val="5F6B73"/>
+              <w:sz w:val="14"/>
+              <w:szCs w:val="14"/>
+            </w:rPr>
+            <w:t xml:space="preserve">enadep.com</w:t>
           </w:r>
         </w:p>
       </w:tc>
@@ -3304,7 +3359,7 @@
         <w:sz w:val="12"/>
         <w:szCs w:val="12"/>
       </w:rPr>
-      <w:t xml:space="preserve">Informations à jour au 23 septembre 2026 – sources : apec.fr, ara.avenir-actifs.org, vae.gouv.fr, moncompteformation.gouv.fr. Montants et règles susceptibles d’évoluer.</w:t>
+      <w:t xml:space="preserve">À jour au 23 septembre 2026 – sources : apec.fr, ara.avenir-actifs.org, vae.gouv.fr, moncompteformation.gouv.fr, opcoep.fr, enadep.com. Montants et règles susceptibles d’évoluer.</w:t>
     </w:r>
     <w:r>
       <w:rPr>
@@ -3392,7 +3447,7 @@
         <w:sz w:val="12"/>
         <w:szCs w:val="12"/>
       </w:rPr>
-      <w:t xml:space="preserve">Informations à jour au 23 septembre 2026 – sources : apec.fr, ara.avenir-actifs.org, vae.gouv.fr, moncompteformation.gouv.fr. Montants et règles susceptibles d’évoluer.</w:t>
+      <w:t xml:space="preserve">À jour au 23 septembre 2026 – sources : apec.fr, ara.avenir-actifs.org, vae.gouv.fr, moncompteformation.gouv.fr, opcoep.fr, enadep.com. Montants et règles susceptibles d’évoluer.</w:t>
     </w:r>
     <w:r>
       <w:rPr>

</xml_diff>